<commit_message>
Tracker: Glycol loop PM; items Word file regenerated
Co-Authored-By: Claude Fable 5.1 <noreply@anthropic.com>
Claude-Session: https://claude.ai/code/session_01CLBd5dCjDQxsTpMcL6aiPJ
</commit_message>
<xml_diff>
--- a/docs/Engineer Tracker - items.docx
+++ b/docs/Engineer Tracker - items.docx
@@ -22,7 +22,7 @@
           <w:sz w:val="21"/>
           <w:szCs w:val="21"/>
         </w:rPr>
-        <w:t xml:space="preserve">UPark Operations Dashboard · Admin → Tracker · as of 2026-10-09</w:t>
+        <w:t xml:space="preserve">UPark Operations Dashboard · Admin → Tracker · as of 2026-10-15</w:t>
       </w:r>
     </w:p>
     <w:p>
@@ -1378,7 +1378,7 @@
           <w:sz w:val="21"/>
           <w:szCs w:val="21"/>
         </w:rPr>
-        <w:t xml:space="preserve">56 items in 14 groups.</w:t>
+        <w:t xml:space="preserve">57 items in 14 groups.</w:t>
       </w:r>
     </w:p>
     <w:p>
@@ -4208,7 +4208,7 @@
         <w:spacing w:after="80" w:before="240"/>
       </w:pPr>
       <w:r>
-        <w:t xml:space="preserve">Preventive maintenance  (8)</w:t>
+        <w:t xml:space="preserve">Preventive maintenance  (9)</w:t>
       </w:r>
     </w:p>
     <w:tbl>
@@ -4650,6 +4650,53 @@
                 <w:szCs w:val="20"/>
               </w:rPr>
               <w:t xml:space="preserve"/>
+            </w:r>
+          </w:p>
+        </w:tc>
+      </w:tr>
+      <w:tr>
+        <w:tc>
+          <w:tcPr>
+            <w:tcW w:type="dxa" w:w="3600"/>
+            <w:tcMar>
+              <w:top w:type="dxa" w:w="60"/>
+              <w:left w:type="dxa" w:w="100"/>
+              <w:bottom w:type="dxa" w:w="60"/>
+              <w:right w:type="dxa" w:w="100"/>
+            </w:tcMar>
+          </w:tcPr>
+          <w:p>
+            <w:r>
+              <w:rPr>
+                <w:b w:val="false"/>
+                <w:bCs w:val="false"/>
+                <w:sz w:val="20"/>
+                <w:szCs w:val="20"/>
+              </w:rPr>
+              <w:t xml:space="preserve">Glycol loop PM</w:t>
+            </w:r>
+          </w:p>
+        </w:tc>
+        <w:tc>
+          <w:tcPr>
+            <w:tcW w:type="dxa" w:w="5760"/>
+            <w:tcMar>
+              <w:top w:type="dxa" w:w="60"/>
+              <w:left w:type="dxa" w:w="100"/>
+              <w:bottom w:type="dxa" w:w="60"/>
+              <w:right w:type="dxa" w:w="100"/>
+            </w:tcMar>
+          </w:tcPr>
+          <w:p>
+            <w:r>
+              <w:rPr>
+                <w:b w:val="false"/>
+                <w:bCs w:val="false"/>
+                <w:color w:val="666666"/>
+                <w:sz w:val="20"/>
+                <w:szCs w:val="20"/>
+              </w:rPr>
+              <w:t xml:space="preserve">concentration, freeze point, make-up, inhibitor</w:t>
             </w:r>
           </w:p>
         </w:tc>

</xml_diff>